<commit_message>
Clarify paper conditions and disclose supplementary tradeoffs; remove residual branding
</commit_message>
<xml_diff>
--- a/docs/Supplementary_Report_KO.docx
+++ b/docs/Supplementary_Report_KO.docx
@@ -7,14 +7,12 @@
         <w:pStyle w:val="Title"/>
       </w:pPr>
       <w:r>
-        <w:t>소리이음 논문 보완 실험 통합 보고</w:t>
+        <w:t>기억 쓰기 승인 규칙의 추가 실험 결과</w:t>
       </w:r>
     </w:p>
     <w:p>
       <w:r>
-        <w:t>핵심 사례와 검증기 비교 · 외부 데이터 검증</w:t>
-        <w:br/>
-        <w:t>정리일 2026년 10월 4일</w:t>
+        <w:t>추출기 개입과 LLM 검증기 비교 및 실제 음성 인식 데이터 진단</w:t>
       </w:r>
     </w:p>
     <w:p>
@@ -83,6 +81,7 @@
           </w:tcPr>
           <w:p>
             <w:pPr>
+              <w:keepNext/>
               <w:spacing w:after="40" w:line="252" w:lineRule="auto"/>
             </w:pPr>
             <w:r>
@@ -113,6 +112,7 @@
           </w:tcPr>
           <w:p>
             <w:pPr>
+              <w:keepNext/>
               <w:spacing w:after="40" w:line="252" w:lineRule="auto"/>
             </w:pPr>
             <w:r>
@@ -143,6 +143,7 @@
           </w:tcPr>
           <w:p>
             <w:pPr>
+              <w:keepNext/>
               <w:spacing w:after="40" w:line="252" w:lineRule="auto"/>
             </w:pPr>
             <w:r>
@@ -173,6 +174,7 @@
           </w:tcPr>
           <w:p>
             <w:pPr>
+              <w:keepNext/>
               <w:spacing w:after="40" w:line="252" w:lineRule="auto"/>
             </w:pPr>
             <w:r>
@@ -208,6 +210,7 @@
           </w:tcPr>
           <w:p>
             <w:pPr>
+              <w:keepNext/>
               <w:spacing w:after="40" w:line="252" w:lineRule="auto"/>
             </w:pPr>
             <w:r>
@@ -238,6 +241,7 @@
           </w:tcPr>
           <w:p>
             <w:pPr>
+              <w:keepNext/>
               <w:spacing w:after="40" w:line="252" w:lineRule="auto"/>
             </w:pPr>
             <w:r>
@@ -268,6 +272,7 @@
           </w:tcPr>
           <w:p>
             <w:pPr>
+              <w:keepNext/>
               <w:spacing w:after="40" w:line="252" w:lineRule="auto"/>
             </w:pPr>
             <w:r>
@@ -298,6 +303,7 @@
           </w:tcPr>
           <w:p>
             <w:pPr>
+              <w:keepNext/>
               <w:spacing w:after="40" w:line="252" w:lineRule="auto"/>
             </w:pPr>
             <w:r>
@@ -333,6 +339,7 @@
           </w:tcPr>
           <w:p>
             <w:pPr>
+              <w:keepNext/>
               <w:spacing w:after="40" w:line="252" w:lineRule="auto"/>
             </w:pPr>
             <w:r>
@@ -363,6 +370,7 @@
           </w:tcPr>
           <w:p>
             <w:pPr>
+              <w:keepNext/>
               <w:spacing w:after="40" w:line="252" w:lineRule="auto"/>
             </w:pPr>
             <w:r>
@@ -393,6 +401,7 @@
           </w:tcPr>
           <w:p>
             <w:pPr>
+              <w:keepNext/>
               <w:spacing w:after="40" w:line="252" w:lineRule="auto"/>
             </w:pPr>
             <w:r>
@@ -423,6 +432,7 @@
           </w:tcPr>
           <w:p>
             <w:pPr>
+              <w:keepNext/>
               <w:spacing w:after="40" w:line="252" w:lineRule="auto"/>
             </w:pPr>
             <w:r>
@@ -458,6 +468,7 @@
           </w:tcPr>
           <w:p>
             <w:pPr>
+              <w:keepNext/>
               <w:spacing w:after="40" w:line="252" w:lineRule="auto"/>
             </w:pPr>
             <w:r>
@@ -488,6 +499,7 @@
           </w:tcPr>
           <w:p>
             <w:pPr>
+              <w:keepNext/>
               <w:spacing w:after="40" w:line="252" w:lineRule="auto"/>
             </w:pPr>
             <w:r>
@@ -518,6 +530,7 @@
           </w:tcPr>
           <w:p>
             <w:pPr>
+              <w:keepNext/>
               <w:spacing w:after="40" w:line="252" w:lineRule="auto"/>
             </w:pPr>
             <w:r>
@@ -548,6 +561,7 @@
           </w:tcPr>
           <w:p>
             <w:pPr>
+              <w:keepNext/>
               <w:spacing w:after="40" w:line="252" w:lineRule="auto"/>
             </w:pPr>
             <w:r>
@@ -583,6 +597,7 @@
           </w:tcPr>
           <w:p>
             <w:pPr>
+              <w:keepNext/>
               <w:spacing w:after="40" w:line="252" w:lineRule="auto"/>
             </w:pPr>
             <w:r>
@@ -613,6 +628,7 @@
           </w:tcPr>
           <w:p>
             <w:pPr>
+              <w:keepNext/>
               <w:spacing w:after="40" w:line="252" w:lineRule="auto"/>
             </w:pPr>
             <w:r>
@@ -643,6 +659,7 @@
           </w:tcPr>
           <w:p>
             <w:pPr>
+              <w:keepNext/>
               <w:spacing w:after="40" w:line="252" w:lineRule="auto"/>
             </w:pPr>
             <w:r>
@@ -673,6 +690,7 @@
           </w:tcPr>
           <w:p>
             <w:pPr>
+              <w:keepNext/>
               <w:spacing w:after="40" w:line="252" w:lineRule="auto"/>
             </w:pPr>
             <w:r>
@@ -828,20 +846,19 @@
     </w:p>
     <w:p>
       <w:r>
-        <w:t>논문 반영: 선택한 네 사례에서 정정 증거와 승인 입력 사이의 표현 누락을 확인했다. 이는 국소적 메커니즘 근거이며, 5개 모두를 새로 회복했다거나 전체 모집단에서 80%p 개선했다고 주장하지 않는다. 참조는 기존 작성 기준이며 독립 사람 gold가 아니다.</w:t>
+        <w:t>선택한 네 사례에서 정정 증거와 승인 입력 사이의 표현 누락을 확인했다. 이는 선택 사례의 국소적 메커니즘 근거다. CT01은 원지침에서도 성공했으므로 회복 효과에 포함하지 않는다. 참조는 기존 작성 기준이며 독립 사람 gold가 아니다.</w:t>
       </w:r>
     </w:p>
     <w:p>
-      <w:r>
-        <w:br w:type="page"/>
-      </w:r>
+      <w:r/>
     </w:p>
     <w:p>
       <w:pPr>
         <w:pStyle w:val="Heading1"/>
+        <w:pageBreakBefore/>
       </w:pPr>
       <w:r>
-        <w:t>1 추가 검증기와 새로운 모델에서의 비교</w:t>
+        <w:t>2 LLM 검증기와 다른 모델에서의 비교</w:t>
       </w:r>
     </w:p>
     <w:p>
@@ -907,6 +924,7 @@
           </w:tcPr>
           <w:p>
             <w:pPr>
+              <w:keepNext/>
               <w:spacing w:after="40" w:line="252" w:lineRule="auto"/>
             </w:pPr>
             <w:r>
@@ -937,6 +955,7 @@
           </w:tcPr>
           <w:p>
             <w:pPr>
+              <w:keepNext/>
               <w:spacing w:after="40" w:line="252" w:lineRule="auto"/>
             </w:pPr>
             <w:r>
@@ -967,6 +986,7 @@
           </w:tcPr>
           <w:p>
             <w:pPr>
+              <w:keepNext/>
               <w:spacing w:after="40" w:line="252" w:lineRule="auto"/>
             </w:pPr>
             <w:r>
@@ -999,6 +1019,7 @@
           </w:tcPr>
           <w:p>
             <w:pPr>
+              <w:keepNext/>
               <w:spacing w:after="40" w:line="252" w:lineRule="auto"/>
             </w:pPr>
             <w:r>
@@ -1031,6 +1052,7 @@
           </w:tcPr>
           <w:p>
             <w:pPr>
+              <w:keepNext/>
               <w:spacing w:after="40" w:line="252" w:lineRule="auto"/>
             </w:pPr>
             <w:r>
@@ -1063,6 +1085,7 @@
           </w:tcPr>
           <w:p>
             <w:pPr>
+              <w:keepNext/>
               <w:spacing w:after="40" w:line="252" w:lineRule="auto"/>
             </w:pPr>
             <w:r>
@@ -1100,6 +1123,7 @@
           </w:tcPr>
           <w:p>
             <w:pPr>
+              <w:keepNext/>
               <w:spacing w:after="40" w:line="252" w:lineRule="auto"/>
             </w:pPr>
             <w:r>
@@ -1130,6 +1154,7 @@
           </w:tcPr>
           <w:p>
             <w:pPr>
+              <w:keepNext/>
               <w:spacing w:after="40" w:line="252" w:lineRule="auto"/>
             </w:pPr>
             <w:r>
@@ -1160,6 +1185,7 @@
           </w:tcPr>
           <w:p>
             <w:pPr>
+              <w:keepNext/>
               <w:spacing w:after="40" w:line="252" w:lineRule="auto"/>
             </w:pPr>
             <w:r>
@@ -1190,6 +1216,7 @@
           </w:tcPr>
           <w:p>
             <w:pPr>
+              <w:keepNext/>
               <w:spacing w:after="40" w:line="252" w:lineRule="auto"/>
             </w:pPr>
             <w:r>
@@ -1220,6 +1247,7 @@
           </w:tcPr>
           <w:p>
             <w:pPr>
+              <w:keepNext/>
               <w:spacing w:after="40" w:line="252" w:lineRule="auto"/>
             </w:pPr>
             <w:r>
@@ -1250,6 +1278,7 @@
           </w:tcPr>
           <w:p>
             <w:pPr>
+              <w:keepNext/>
               <w:spacing w:after="40" w:line="252" w:lineRule="auto"/>
             </w:pPr>
             <w:r>
@@ -1285,6 +1314,7 @@
           </w:tcPr>
           <w:p>
             <w:pPr>
+              <w:keepNext/>
               <w:spacing w:after="40" w:line="252" w:lineRule="auto"/>
             </w:pPr>
             <w:r>
@@ -1314,6 +1344,7 @@
           </w:tcPr>
           <w:p>
             <w:pPr>
+              <w:keepNext/>
               <w:spacing w:after="40" w:line="252" w:lineRule="auto"/>
             </w:pPr>
             <w:r>
@@ -1344,6 +1375,7 @@
           </w:tcPr>
           <w:p>
             <w:pPr>
+              <w:keepNext/>
               <w:spacing w:after="40" w:line="252" w:lineRule="auto"/>
             </w:pPr>
             <w:r>
@@ -1374,6 +1406,7 @@
           </w:tcPr>
           <w:p>
             <w:pPr>
+              <w:keepNext/>
               <w:spacing w:after="40" w:line="252" w:lineRule="auto"/>
             </w:pPr>
             <w:r>
@@ -1404,6 +1437,7 @@
           </w:tcPr>
           <w:p>
             <w:pPr>
+              <w:keepNext/>
               <w:spacing w:after="40" w:line="252" w:lineRule="auto"/>
             </w:pPr>
             <w:r>
@@ -1434,6 +1468,7 @@
           </w:tcPr>
           <w:p>
             <w:pPr>
+              <w:keepNext/>
               <w:spacing w:after="40" w:line="252" w:lineRule="auto"/>
             </w:pPr>
             <w:r>
@@ -1469,6 +1504,7 @@
           </w:tcPr>
           <w:p>
             <w:pPr>
+              <w:keepNext/>
               <w:spacing w:after="40" w:line="252" w:lineRule="auto"/>
             </w:pPr>
             <w:r>
@@ -1498,6 +1534,7 @@
           </w:tcPr>
           <w:p>
             <w:pPr>
+              <w:keepNext/>
               <w:spacing w:after="40" w:line="252" w:lineRule="auto"/>
             </w:pPr>
             <w:r>
@@ -1528,6 +1565,7 @@
           </w:tcPr>
           <w:p>
             <w:pPr>
+              <w:keepNext/>
               <w:spacing w:after="40" w:line="252" w:lineRule="auto"/>
             </w:pPr>
             <w:r>
@@ -1558,6 +1596,7 @@
           </w:tcPr>
           <w:p>
             <w:pPr>
+              <w:keepNext/>
               <w:spacing w:after="40" w:line="252" w:lineRule="auto"/>
             </w:pPr>
             <w:r>
@@ -1588,6 +1627,7 @@
           </w:tcPr>
           <w:p>
             <w:pPr>
+              <w:keepNext/>
               <w:spacing w:after="40" w:line="252" w:lineRule="auto"/>
             </w:pPr>
             <w:r>
@@ -1618,6 +1658,7 @@
           </w:tcPr>
           <w:p>
             <w:pPr>
+              <w:keepNext/>
               <w:spacing w:after="40" w:line="252" w:lineRule="auto"/>
             </w:pPr>
             <w:r>
@@ -1653,6 +1694,7 @@
           </w:tcPr>
           <w:p>
             <w:pPr>
+              <w:keepNext/>
               <w:spacing w:after="40" w:line="252" w:lineRule="auto"/>
             </w:pPr>
             <w:r>
@@ -1683,6 +1725,7 @@
           </w:tcPr>
           <w:p>
             <w:pPr>
+              <w:keepNext/>
               <w:spacing w:after="40" w:line="252" w:lineRule="auto"/>
             </w:pPr>
             <w:r>
@@ -1713,6 +1756,7 @@
           </w:tcPr>
           <w:p>
             <w:pPr>
+              <w:keepNext/>
               <w:spacing w:after="40" w:line="252" w:lineRule="auto"/>
             </w:pPr>
             <w:r>
@@ -1743,6 +1787,7 @@
           </w:tcPr>
           <w:p>
             <w:pPr>
+              <w:keepNext/>
               <w:spacing w:after="40" w:line="252" w:lineRule="auto"/>
             </w:pPr>
             <w:r>
@@ -1773,6 +1818,7 @@
           </w:tcPr>
           <w:p>
             <w:pPr>
+              <w:keepNext/>
               <w:spacing w:after="40" w:line="252" w:lineRule="auto"/>
             </w:pPr>
             <w:r>
@@ -1803,6 +1849,7 @@
           </w:tcPr>
           <w:p>
             <w:pPr>
+              <w:keepNext/>
               <w:spacing w:after="40" w:line="252" w:lineRule="auto"/>
             </w:pPr>
             <w:r>
@@ -1838,6 +1885,7 @@
           </w:tcPr>
           <w:p>
             <w:pPr>
+              <w:keepNext/>
               <w:spacing w:after="40" w:line="252" w:lineRule="auto"/>
             </w:pPr>
             <w:r>
@@ -1867,6 +1915,7 @@
           </w:tcPr>
           <w:p>
             <w:pPr>
+              <w:keepNext/>
               <w:spacing w:after="40" w:line="252" w:lineRule="auto"/>
             </w:pPr>
             <w:r>
@@ -1897,6 +1946,7 @@
           </w:tcPr>
           <w:p>
             <w:pPr>
+              <w:keepNext/>
               <w:spacing w:after="40" w:line="252" w:lineRule="auto"/>
             </w:pPr>
             <w:r>
@@ -1927,6 +1977,7 @@
           </w:tcPr>
           <w:p>
             <w:pPr>
+              <w:keepNext/>
               <w:spacing w:after="40" w:line="252" w:lineRule="auto"/>
             </w:pPr>
             <w:r>
@@ -1957,6 +2008,7 @@
           </w:tcPr>
           <w:p>
             <w:pPr>
+              <w:keepNext/>
               <w:spacing w:after="40" w:line="252" w:lineRule="auto"/>
             </w:pPr>
             <w:r>
@@ -1987,6 +2039,7 @@
           </w:tcPr>
           <w:p>
             <w:pPr>
+              <w:keepNext/>
               <w:spacing w:after="40" w:line="252" w:lineRule="auto"/>
             </w:pPr>
             <w:r>
@@ -2022,6 +2075,7 @@
           </w:tcPr>
           <w:p>
             <w:pPr>
+              <w:keepNext/>
               <w:spacing w:after="40" w:line="252" w:lineRule="auto"/>
             </w:pPr>
             <w:r>
@@ -2051,6 +2105,7 @@
           </w:tcPr>
           <w:p>
             <w:pPr>
+              <w:keepNext/>
               <w:spacing w:after="40" w:line="252" w:lineRule="auto"/>
             </w:pPr>
             <w:r>
@@ -2081,6 +2136,7 @@
           </w:tcPr>
           <w:p>
             <w:pPr>
+              <w:keepNext/>
               <w:spacing w:after="40" w:line="252" w:lineRule="auto"/>
             </w:pPr>
             <w:r>
@@ -2111,6 +2167,7 @@
           </w:tcPr>
           <w:p>
             <w:pPr>
+              <w:keepNext/>
               <w:spacing w:after="40" w:line="252" w:lineRule="auto"/>
             </w:pPr>
             <w:r>
@@ -2141,6 +2198,7 @@
           </w:tcPr>
           <w:p>
             <w:pPr>
+              <w:keepNext/>
               <w:spacing w:after="40" w:line="252" w:lineRule="auto"/>
             </w:pPr>
             <w:r>
@@ -2171,6 +2229,7 @@
           </w:tcPr>
           <w:p>
             <w:pPr>
+              <w:keepNext/>
               <w:spacing w:after="40" w:line="252" w:lineRule="auto"/>
             </w:pPr>
             <w:r>
@@ -2206,6 +2265,7 @@
           </w:tcPr>
           <w:p>
             <w:pPr>
+              <w:keepNext/>
               <w:spacing w:after="40" w:line="252" w:lineRule="auto"/>
             </w:pPr>
             <w:r>
@@ -2236,6 +2296,7 @@
           </w:tcPr>
           <w:p>
             <w:pPr>
+              <w:keepNext/>
               <w:spacing w:after="40" w:line="252" w:lineRule="auto"/>
             </w:pPr>
             <w:r>
@@ -2266,6 +2327,7 @@
           </w:tcPr>
           <w:p>
             <w:pPr>
+              <w:keepNext/>
               <w:spacing w:after="40" w:line="252" w:lineRule="auto"/>
             </w:pPr>
             <w:r>
@@ -2296,6 +2358,7 @@
           </w:tcPr>
           <w:p>
             <w:pPr>
+              <w:keepNext/>
               <w:spacing w:after="40" w:line="252" w:lineRule="auto"/>
             </w:pPr>
             <w:r>
@@ -2326,6 +2389,7 @@
           </w:tcPr>
           <w:p>
             <w:pPr>
+              <w:keepNext/>
               <w:spacing w:after="40" w:line="252" w:lineRule="auto"/>
             </w:pPr>
             <w:r>
@@ -2356,6 +2420,7 @@
           </w:tcPr>
           <w:p>
             <w:pPr>
+              <w:keepNext/>
               <w:spacing w:after="40" w:line="252" w:lineRule="auto"/>
             </w:pPr>
             <w:r>
@@ -2391,6 +2456,7 @@
           </w:tcPr>
           <w:p>
             <w:pPr>
+              <w:keepNext/>
               <w:spacing w:after="40" w:line="252" w:lineRule="auto"/>
             </w:pPr>
             <w:r>
@@ -2420,6 +2486,7 @@
           </w:tcPr>
           <w:p>
             <w:pPr>
+              <w:keepNext/>
               <w:spacing w:after="40" w:line="252" w:lineRule="auto"/>
             </w:pPr>
             <w:r>
@@ -2450,6 +2517,7 @@
           </w:tcPr>
           <w:p>
             <w:pPr>
+              <w:keepNext/>
               <w:spacing w:after="40" w:line="252" w:lineRule="auto"/>
             </w:pPr>
             <w:r>
@@ -2480,6 +2548,7 @@
           </w:tcPr>
           <w:p>
             <w:pPr>
+              <w:keepNext/>
               <w:spacing w:after="40" w:line="252" w:lineRule="auto"/>
             </w:pPr>
             <w:r>
@@ -2510,6 +2579,7 @@
           </w:tcPr>
           <w:p>
             <w:pPr>
+              <w:keepNext/>
               <w:spacing w:after="40" w:line="252" w:lineRule="auto"/>
             </w:pPr>
             <w:r>
@@ -2540,6 +2610,7 @@
           </w:tcPr>
           <w:p>
             <w:pPr>
+              <w:keepNext/>
               <w:spacing w:after="40" w:line="252" w:lineRule="auto"/>
             </w:pPr>
             <w:r>
@@ -2757,25 +2828,24 @@
         <w:pStyle w:val="Heading2"/>
       </w:pPr>
       <w:r>
-        <w:t>비용과 논문에 남길 주장</w:t>
+        <w:t>추가 호출 비용과 결과 해석</w:t>
       </w:r>
     </w:p>
     <w:p>
       <w:r>
-        <w:t>추가 검증에는 144회 호출이 필요했고 평균 요청 지연은 4.39초였다. 저장된 제안을 재사용하면 제안 생성은 반복하지 않아도 되지만, LLM 검증 자체가 무료가 되는 것은 아니다. 기여는 결정적 규칙의 보편적 우월성이 아니라, 승인 경계를 분리해 다른 규칙과 학습된 검증기를 같은 제안 위에서 비교할 수 있다는 점이다.</w:t>
+        <w:t>추가 검증에는 144회 호출이 필요했고 평균 요청 지연은 4.39초였다. 저장된 제안을 재사용하면 제안 생성은 반복하지 않아도 되지만, LLM 검증 자체가 무료가 되는 것은 아니다. 기여는 결정적 규칙의 보편적 우월성이 아니라, 승인 경계를 분리해 다른 규칙과 LLM 검증기를 같은 제안 위에서 비교할 수 있다는 점이다.</w:t>
       </w:r>
     </w:p>
     <w:p>
-      <w:r>
-        <w:br w:type="page"/>
-      </w:r>
+      <w:r/>
     </w:p>
     <w:p>
       <w:pPr>
         <w:pStyle w:val="Heading1"/>
+        <w:pageBreakBefore/>
       </w:pPr>
       <w:r>
-        <w:t>2 DSTC2 실제 음성 인식 데이터 검증</w:t>
+        <w:t>3 DSTC2 실제 음성 인식 데이터 검증</w:t>
       </w:r>
     </w:p>
     <w:p>
@@ -2823,6 +2893,7 @@
           </w:tcPr>
           <w:p>
             <w:pPr>
+              <w:keepNext/>
               <w:spacing w:after="40" w:line="252" w:lineRule="auto"/>
             </w:pPr>
             <w:r>
@@ -2853,6 +2924,7 @@
           </w:tcPr>
           <w:p>
             <w:pPr>
+              <w:keepNext/>
               <w:spacing w:after="40" w:line="252" w:lineRule="auto"/>
             </w:pPr>
             <w:r>
@@ -2883,6 +2955,7 @@
           </w:tcPr>
           <w:p>
             <w:pPr>
+              <w:keepNext/>
               <w:spacing w:after="40" w:line="252" w:lineRule="auto"/>
             </w:pPr>
             <w:r>
@@ -2913,6 +2986,7 @@
           </w:tcPr>
           <w:p>
             <w:pPr>
+              <w:keepNext/>
               <w:spacing w:after="40" w:line="252" w:lineRule="auto"/>
             </w:pPr>
             <w:r>
@@ -2948,6 +3022,7 @@
           </w:tcPr>
           <w:p>
             <w:pPr>
+              <w:keepNext/>
               <w:spacing w:after="40" w:line="252" w:lineRule="auto"/>
             </w:pPr>
             <w:r>
@@ -2978,6 +3053,7 @@
           </w:tcPr>
           <w:p>
             <w:pPr>
+              <w:keepNext/>
               <w:spacing w:after="40" w:line="252" w:lineRule="auto"/>
             </w:pPr>
             <w:r>
@@ -3008,6 +3084,7 @@
           </w:tcPr>
           <w:p>
             <w:pPr>
+              <w:keepNext/>
               <w:spacing w:after="40" w:line="252" w:lineRule="auto"/>
             </w:pPr>
             <w:r>
@@ -3038,6 +3115,7 @@
           </w:tcPr>
           <w:p>
             <w:pPr>
+              <w:keepNext/>
               <w:spacing w:after="40" w:line="252" w:lineRule="auto"/>
             </w:pPr>
             <w:r>
@@ -3073,6 +3151,7 @@
           </w:tcPr>
           <w:p>
             <w:pPr>
+              <w:keepNext/>
               <w:spacing w:after="40" w:line="252" w:lineRule="auto"/>
             </w:pPr>
             <w:r>
@@ -3103,6 +3182,7 @@
           </w:tcPr>
           <w:p>
             <w:pPr>
+              <w:keepNext/>
               <w:spacing w:after="40" w:line="252" w:lineRule="auto"/>
             </w:pPr>
             <w:r>
@@ -3133,6 +3213,7 @@
           </w:tcPr>
           <w:p>
             <w:pPr>
+              <w:keepNext/>
               <w:spacing w:after="40" w:line="252" w:lineRule="auto"/>
             </w:pPr>
             <w:r>
@@ -3163,6 +3244,7 @@
           </w:tcPr>
           <w:p>
             <w:pPr>
+              <w:keepNext/>
               <w:spacing w:after="40" w:line="252" w:lineRule="auto"/>
             </w:pPr>
             <w:r>
@@ -3198,6 +3280,7 @@
           </w:tcPr>
           <w:p>
             <w:pPr>
+              <w:keepNext/>
               <w:spacing w:after="40" w:line="252" w:lineRule="auto"/>
             </w:pPr>
             <w:r>
@@ -3228,6 +3311,7 @@
           </w:tcPr>
           <w:p>
             <w:pPr>
+              <w:keepNext/>
               <w:spacing w:after="40" w:line="252" w:lineRule="auto"/>
             </w:pPr>
             <w:r>
@@ -3258,6 +3342,7 @@
           </w:tcPr>
           <w:p>
             <w:pPr>
+              <w:keepNext/>
               <w:spacing w:after="40" w:line="252" w:lineRule="auto"/>
             </w:pPr>
             <w:r>
@@ -3288,6 +3373,7 @@
           </w:tcPr>
           <w:p>
             <w:pPr>
+              <w:keepNext/>
               <w:spacing w:after="40" w:line="252" w:lineRule="auto"/>
             </w:pPr>
             <w:r>
@@ -3323,6 +3409,7 @@
           </w:tcPr>
           <w:p>
             <w:pPr>
+              <w:keepNext/>
               <w:spacing w:after="40" w:line="252" w:lineRule="auto"/>
             </w:pPr>
             <w:r>
@@ -3353,6 +3440,7 @@
           </w:tcPr>
           <w:p>
             <w:pPr>
+              <w:keepNext/>
               <w:spacing w:after="40" w:line="252" w:lineRule="auto"/>
             </w:pPr>
             <w:r>
@@ -3383,6 +3471,7 @@
           </w:tcPr>
           <w:p>
             <w:pPr>
+              <w:keepNext/>
               <w:spacing w:after="40" w:line="252" w:lineRule="auto"/>
             </w:pPr>
             <w:r>
@@ -3413,6 +3502,7 @@
           </w:tcPr>
           <w:p>
             <w:pPr>
+              <w:keepNext/>
               <w:spacing w:after="40" w:line="252" w:lineRule="auto"/>
             </w:pPr>
             <w:r>
@@ -3614,6 +3704,7 @@
           </w:tcPr>
           <w:p>
             <w:pPr>
+              <w:keepNext/>
               <w:spacing w:after="40" w:line="252" w:lineRule="auto"/>
             </w:pPr>
             <w:r>
@@ -3644,6 +3735,7 @@
           </w:tcPr>
           <w:p>
             <w:pPr>
+              <w:keepNext/>
               <w:spacing w:after="40" w:line="252" w:lineRule="auto"/>
             </w:pPr>
             <w:r>
@@ -3674,6 +3766,7 @@
           </w:tcPr>
           <w:p>
             <w:pPr>
+              <w:keepNext/>
               <w:spacing w:after="40" w:line="252" w:lineRule="auto"/>
             </w:pPr>
             <w:r>
@@ -3704,6 +3797,7 @@
           </w:tcPr>
           <w:p>
             <w:pPr>
+              <w:keepNext/>
               <w:spacing w:after="40" w:line="252" w:lineRule="auto"/>
             </w:pPr>
             <w:r>
@@ -3739,6 +3833,7 @@
           </w:tcPr>
           <w:p>
             <w:pPr>
+              <w:keepNext/>
               <w:spacing w:after="40" w:line="252" w:lineRule="auto"/>
             </w:pPr>
             <w:r>
@@ -3769,6 +3864,7 @@
           </w:tcPr>
           <w:p>
             <w:pPr>
+              <w:keepNext/>
               <w:spacing w:after="40" w:line="252" w:lineRule="auto"/>
             </w:pPr>
             <w:r>
@@ -3799,6 +3895,7 @@
           </w:tcPr>
           <w:p>
             <w:pPr>
+              <w:keepNext/>
               <w:spacing w:after="40" w:line="252" w:lineRule="auto"/>
             </w:pPr>
             <w:r>
@@ -3829,6 +3926,7 @@
           </w:tcPr>
           <w:p>
             <w:pPr>
+              <w:keepNext/>
               <w:spacing w:after="40" w:line="252" w:lineRule="auto"/>
             </w:pPr>
             <w:r>
@@ -3864,6 +3962,7 @@
           </w:tcPr>
           <w:p>
             <w:pPr>
+              <w:keepNext/>
               <w:spacing w:after="40" w:line="252" w:lineRule="auto"/>
             </w:pPr>
             <w:r>
@@ -3894,6 +3993,7 @@
           </w:tcPr>
           <w:p>
             <w:pPr>
+              <w:keepNext/>
               <w:spacing w:after="40" w:line="252" w:lineRule="auto"/>
             </w:pPr>
             <w:r>
@@ -3924,6 +4024,7 @@
           </w:tcPr>
           <w:p>
             <w:pPr>
+              <w:keepNext/>
               <w:spacing w:after="40" w:line="252" w:lineRule="auto"/>
             </w:pPr>
             <w:r>
@@ -3954,6 +4055,7 @@
           </w:tcPr>
           <w:p>
             <w:pPr>
+              <w:keepNext/>
               <w:spacing w:after="40" w:line="252" w:lineRule="auto"/>
             </w:pPr>
             <w:r>
@@ -4103,16 +4205,15 @@
       </w:r>
     </w:p>
     <w:p>
-      <w:r>
-        <w:br w:type="page"/>
-      </w:r>
+      <w:r/>
     </w:p>
     <w:p>
       <w:pPr>
         <w:pStyle w:val="Heading1"/>
+        <w:pageBreakBefore/>
       </w:pPr>
       <w:r>
-        <w:t>2 실제 사례와 CareCall 확보 상태</w:t>
+        <w:t>4 사례 분석과 데이터 이용 범위</w:t>
       </w:r>
     </w:p>
     <w:p>
@@ -4156,12 +4257,7 @@
         <w:pStyle w:val="Heading1"/>
       </w:pPr>
       <w:r>
-        <w:t>두 보완을 연결한 논문 수정 방향</w:t>
-      </w:r>
-    </w:p>
-    <w:p>
-      <w:r>
-        <w:t>메커니즘 절에는 핵심 5사례의 전후 비교를 넣어 추출 표현과 승인 입력의 누락을 설명한다. 기준선 절에는 LLM 검증기 결과와 추가 호출 비용을 넣는다. 외부 검증 절에는 DSTC2 전체·유형별 결과와 두 실제 사례를 배치하고, CareCall은 자료 확보 후의 검증으로 남긴다.</w:t>
+        <w:t>결과 종합</w:t>
       </w:r>
     </w:p>
     <w:p>
@@ -4174,12 +4270,12 @@
         <w:pStyle w:val="Heading2"/>
       </w:pPr>
       <w:r>
-        <w:t>근거와 완료 범위</w:t>
+        <w:t>공개 근거 자료</w:t>
       </w:r>
     </w:p>
     <w:p>
       <w:r>
-        <w:t>핵심 사례: paper_focal5_completion_20261004/FOCAL_RESULT.json 및 MECHANISM_TRACE.json. 검증기: paper_mechanism_validation_20261004/SUMMARY.json 및 paired_intervals.csv. 외부 검증: paper_external_C1_20261004/run/RESULTS.json, HOLD_TRACES.json, PAIRED_INTERVALS.json. 모두 프로젝트 outputs 아래에 있다.</w:t>
+        <w:t>핵심 사례: supplements/authored/paper_focal5_completion_20261004/의 FOCAL_RESULT.json과 MECHANISM_TRACE.json. 검증기와 외부 검증의 결과·분석 방법·재현 절차는 supplements/README.md와 각 하위 폴더에 수록했다.</w:t>
       </w:r>
     </w:p>
     <w:p>
@@ -4189,7 +4285,7 @@
     </w:p>
     <w:p>
       <w:r>
-        <w:t>이번 문서는 완료된 결과를 통합했다. 신규 모델 호출·학습·재채점은 없으며 TIST_v20 원고는 변경하지 않았다. 기존 메커니즘 보고서의 “5사례 미완료” 표시는 후속 완결 결과로 대체해 읽는다.</w:t>
+        <w:t>본 보고서는 본 실험 이후 수집한 별도 진단 결과를 정리한다. 핵심 사례 개입, LLM 검증기 비교, 실제 ASR 진단은 서로 다른 표본과 절차를 사용하므로 점수를 합산하지 않는다.</w:t>
       </w:r>
     </w:p>
     <w:sectPr>

</xml_diff>